<commit_message>
Articulo V2: texto del cuerpo justificado
Co-Authored-By: Claude Opus 5.5 <noreply@anthropic.com>
Claude-Session: https://claude.ai/code/session_013BqHCBCBMxPVbrFpj9LrZE
</commit_message>
<xml_diff>
--- a/CORRECCION_ARTICULO_V2/ARROYO_ANAYA_V2_control_cambios.docx
+++ b/CORRECCION_ARTICULO_V2/ARROYO_ANAYA_V2_control_cambios.docx
@@ -521,6 +521,7 @@
     <w:p>
       <w:pPr>
         <w:spacing w:after="200"/>
+        <w:jc w:val="both"/>
       </w:pPr>
       <w:r>
         <w:t xml:space="preserve">La durabilidad de las infraestructuras hidráulicas en ambientes marinos tropicales constituye uno de los desafíos más exigentes de la ingeniería civil contemporánea, por la acción sinérgica de temperaturas elevadas, humedad sostenida, penetración de cloruros y sulfatos y bioincrustación marina. Este artículo </w:t>
@@ -743,6 +744,9 @@
       </w:r>
     </w:p>
     <w:p>
+      <w:pPr>
+        <w:jc w:val="both"/>
+      </w:pPr>
       <w:r>
         <w:rPr>
           <w:b/>
@@ -798,6 +802,7 @@
     <w:p>
       <w:pPr>
         <w:spacing w:after="200"/>
+        <w:jc w:val="both"/>
         <w:rPr>
           <w:lang w:val="en-US"/>
         </w:rPr>
@@ -1151,6 +1156,7 @@
     </w:p>
     <w:p>
       <w:pPr>
+        <w:jc w:val="both"/>
         <w:rPr>
           <w:lang w:val="en-US"/>
         </w:rPr>
@@ -1226,6 +1232,7 @@
     <w:p>
       <w:pPr>
         <w:ind w:firstLine="720"/>
+        <w:jc w:val="both"/>
       </w:pPr>
       <w:r>
         <w:t>El deterioro prematuro de las infraestructuras de concreto reforzado expuestas a ambientes marinos tropicales es una problemática de creciente relevancia técnica y económica en el Caribe colombiano. La temperatura media de 30 °C, la humedad sostenida entre 75 % y 85 %, los ciclos de inmersión y emersión de la zona de mareas y las concentraciones de cloruros y sulfatos del agua marina generan una agresividad capaz de reducir la vida útil del material hasta en un 60 % respecto de ambientes templados (Mehta, 2006; Thomas &amp; Bentz, 2000; Troconis de Rincón et al., 2011). A ello se suma una brecha normativa significativa entre las exigencias de durabilidad de la NSR-98 (AIS, 1998) —vigente al construirse numerosas obras costeras— y los requisitos que la NSR-10 y el ACI 318-19 establecen hoy para exposición marina severa (ACI Committee 318, 2019; AIS, 2010).</w:t>
@@ -1234,6 +1241,7 @@
     <w:p>
       <w:pPr>
         <w:ind w:firstLine="720"/>
+        <w:jc w:val="both"/>
       </w:pPr>
       <w:r>
         <w:t xml:space="preserve">El Sistema Bocana Estabilizadora de Mareas (BEM) de Cartagena de Indias sintetiza con claridad esta problemática. Es una infraestructura hidráulica crítica que regula el intercambio controlado de agua entre el mar Caribe y la Ciénaga de la Virgen, contribuyendo a la calidad de un cuerpo de agua históricamente receptor de descargas urbanas y a la mitigación de inundaciones en sectores costeros densamente poblados (Alcaldía Mayor de Cartagena de Indias, 2024; Caracol Radio, 2018). La estructura objeto de este trabajo —un box culvert de diez celdas que aloja las compuertas reguladoras, construido entre 1999 y 2001— ha operado de forma ininterrumpida durante veinticinco años en exposición tipo XS3, sin mantenimiento preventivo documentado, y evidencia hoy un deterioro severo y generalizado que compromete la funcionalidad hidráulica y la seguridad estructural (Establecimiento Público Ambiental de Cartagena [EPA], 2023).</w:t>
@@ -1251,6 +1259,7 @@
     <w:p>
       <w:pPr>
         <w:ind w:firstLine="720"/>
+        <w:jc w:val="both"/>
       </w:pPr>
       <w:r>
         <w:t>El Sistema BEM fue diseñado y construido a finales de los años noventa bajo los criterios de durabilidad de la NSR-98, que no contemplaba requisitos diferenciados para ambientes marinos severos. Frente a esa ausencia de condicionantes sobre relación agua/cemento, resistencia mínima y recubrimientos según categoría de exposición, la NSR-</w:t>
@@ -1261,6 +1270,7 @@
     <w:p>
       <w:pPr>
         <w:ind w:firstLine="720"/>
+        <w:jc w:val="both"/>
       </w:pPr>
       <w:r>
         <w:t>El deterioro no obedece a una causa única sino a tres factores interrelacionados. El primero es la agresividad del ambiente: la temperatura media de 30 °C acelera todos los procesos de difusión iónica, mientras la salinidad del Caribe y los sulfatos de la Ciénaga de la Virgen saturan de manera permanente los mecanismos de transporte hacia el interior del concreto (Chávez-Ulloa, 2013; Costa &amp; Appleton, 1999; Troconis de Rincón et al., 2011). El segundo es la subespecificación material originaria: la permeabilidad del concreto colocado era incompatible con la vida útil proyectada bajo exposición XS3 desde el primer ciclo de operación (ACI Committee 318, 2019; Ospina &amp; Sircar, 2019). El tercero es la ausencia de mantenimiento preventivo durante dos décadas y media, que permitió que patologías incipientes evolucionaran sin intervención hasta el deterioro irreversible que hoy presentan los diez vanos (Helene, 2003; Olavarrieta et al., 2011).</w:t>
@@ -1269,6 +1279,7 @@
     <w:p>
       <w:pPr>
         <w:ind w:firstLine="720"/>
+        <w:jc w:val="both"/>
       </w:pPr>
       <w:r>
         <w:t>Las manifestaciones de este proceso son concluyentes: desprendimiento total del recubrimiento de concreto en zonas extensas de las vigas del tablero; oxidación total y exposición del acero de refuerzo en muros centrales y vigas; fallas por cortante en las vigas de los vanos 3, 5 y 6; eflorescencias y formación de estalactitas en la cara inferior de la losa, indicadoras de concreto poroso y fracturado; reacción árido-álcali en la superficie superior de la losa; bioincrustación generalizada de moluscos y organismos marinos en las superficies sumergidas; y oxidación avanzada de la totalidad de los elementos metálicos —compuertas, perfiles angulares de borde y barandas de protección—.</w:t>
@@ -1277,6 +1288,7 @@
     <w:p>
       <w:pPr>
         <w:ind w:firstLine="720"/>
+        <w:jc w:val="both"/>
       </w:pPr>
       <w:r>
         <w:t xml:space="preserve">Estos hallazgos convergen en la pregunta que orienta el trabajo: ¿cuál es el </w:t>
@@ -1366,6 +1378,7 @@
     <w:p>
       <w:pPr>
         <w:ind w:firstLine="720"/>
+        <w:jc w:val="both"/>
         <w:rPr>
           <w:ins w:id="9384" w:author="Luis David Arroyo Anaya" w:date="2026-10-10T18:00:00Z"/>
         </w:rPr>
@@ -1379,6 +1392,7 @@
     <w:p>
       <w:pPr>
         <w:ind w:firstLine="720"/>
+        <w:jc w:val="both"/>
       </w:pPr>
       <w:r>
         <w:t xml:space="preserve">La investigación se delimita a la estructura tipo box culvert de diez celdas del Sistema BEM, en el sector La Bocana, y excluye el box culvert de la avenida principal, el pescante de Chambacú y el Centro de Información. El análisis parte de la campaña de campo de noviembre de 2024 a abril de 2025 y cubre el período de operación entre 2000 y 2025. El alcance </w:t>
@@ -1459,6 +1473,7 @@
     <w:p>
       <w:pPr>
         <w:ind w:firstLine="720"/>
+        <w:jc w:val="both"/>
       </w:pPr>
       <w:r>
         <w:t xml:space="preserve">El Sistema BEM cumple una función hidráulica y ambiental de primer orden para Cartagena de Indias: la regulación del intercambio de agua entre el mar Caribe y la Ciénaga de la Virgen es esencial para la calidad de un cuerpo de agua históricamente afectado por vertimientos urbanos y para la gestión del riesgo de inundación en los barrios costeros </w:t>
@@ -1469,6 +1484,7 @@
     <w:p>
       <w:pPr>
         <w:ind w:firstLine="720"/>
+        <w:jc w:val="both"/>
       </w:pPr>
       <w:r>
         <w:t>Desde la perspectiva científica, el caso aporta datos de campo reales y cuantificados sobre el comportamiento a largo plazo del concreto reforzado bajo exposición marina tropical en el Caribe colombiano, contexto con literatura específica escasa frente a otras regiones marinas (Oñate López, 2022; Universidad del Norte, 2018). Contrastar los resultados con los modelos de Tuutti (1982), Papadakis et al. (1991) y Thomas y Bentz (2000) permite examinar su aplicabilidad al contexto colombiano y generar conocimiento transferible a otras infraestructuras costeras de la región. En su dimensión normativa, la investigación documenta con evidencia empírica las consecuencias de la brecha entre la NSR-98 y los estándares actuales de durabilidad, y aporta insumos para que proyectistas y entidades territoriales incorporen criterios más estrictos en futuros proyectos costeros (ACI Committee 318, 2019; Fédération Internationale du Béton [fib], 2006; Helene, 2003).</w:t>
@@ -1486,6 +1502,7 @@
     <w:p>
       <w:pPr>
         <w:ind w:firstLine="720"/>
+        <w:jc w:val="both"/>
       </w:pPr>
       <w:r>
         <w:rPr>
@@ -1578,6 +1595,7 @@
     <w:p>
       <w:pPr>
         <w:ind w:firstLine="720"/>
+        <w:jc w:val="both"/>
       </w:pPr>
       <w:r>
         <w:rPr>
@@ -1680,6 +1698,7 @@
     <w:p>
       <w:pPr>
         <w:ind w:firstLine="720"/>
+        <w:jc w:val="both"/>
       </w:pPr>
       <w:r>
         <w:t xml:space="preserve">El artículo se organiza en seis secciones. Tras esta introducción, que integra el planteamiento del problema, la justificación y los objetivos, la sección 2 desarrolla el marco teórico y el estado del arte en cuatro áreas temáticas. La sección 3 expone el diseño metodológico, los instrumentos de recolección aplicados en campo y las técnicas de análisis empleadas. La sección 4 presenta los resultados del levantamiento estructural, del inventario de patologías por vano y de los ensayos de materiales, junto con el cálculo de la resistencia efectiva del concreto y la valoración </w:t>
@@ -1727,6 +1746,7 @@
     <w:p>
       <w:pPr>
         <w:ind w:firstLine="720"/>
+        <w:jc w:val="both"/>
       </w:pPr>
       <w:r>
         <w:t>La revisión de la literatura científica y técnica se organizó en cuatro áreas temáticas, construidas a partir de una búsqueda sistemática en Google Scholar, Scopus, ScienceDirect, ASCE Library y SpringerLink, complementada con los repositorios regionales SciELO y RedALyC. Las palabras clave en español incluyeron ambiente marino tropical, corrosión por cloruros, durabilidad del concreto, estructuras hidráulicas, patología de estructuras marinas y protección catódica; en inglés se emplearon los equivalentes marine environment, tropical marine environment, chloride-induced corrosion, durability of reinforced concrete, service life prediction, hydraulic structures y cathodic protection. Para los documentos normativos se consultaron directamente los repositorios del ACI, ASTM, RILEM, fib y la Asociación Colombiana de Ingeniería Sísmica.</w:t>
@@ -1744,6 +1764,7 @@
     <w:p>
       <w:pPr>
         <w:ind w:firstLine="720"/>
+        <w:jc w:val="both"/>
       </w:pPr>
       <w:r>
         <w:t>El estudio del deterioro del concreto armado en ambiente marino se remonta a Tuutti (1982), cuyo modelo bilineal distingue una fase de iniciación —los agentes agresivos difunden por la red capilar hasta concentraciones críticas en la superficie del acero— y una de propagación, en la que la corrosión genera productos de mayor volumen cuyas presiones fisuran y desprenden el recubrimiento. Page y Treadaway (1982) explicaron su fundamento electroquímico: la alcalinidad de la solución de poros, con pH sobre 12,5, mantiene una capa pasivante estable mientras no la destruyan los cloruros o la caída de pH por carbonatación. La duración de la iniciación depende de la permeabilidad, el recubrimiento, la concentración de cloruros y, de forma especialmente relevante en el trópico, la temperatura (Angst, 2018; Troconis de Rincón et al., 2011).</w:t>
@@ -1752,6 +1773,7 @@
     <w:p>
       <w:pPr>
         <w:ind w:firstLine="720"/>
+        <w:jc w:val="both"/>
       </w:pPr>
       <w:r>
         <w:t>El proyecto iberoamericano DURACON documentó la aceleración del deterioro en ambientes tropicales mediante el seguimiento longitudinal de estructuras en doce países, estableciendo que los ambientes marinos con temperatura media superior a 25 °C reducen los tiempos de iniciación en proporciones que pueden superar el 50 %. Para Cartagena de Indias el efecto es particularmente pronunciado, dado que la difusividad iónica sigue una relación de tipo Arrhenius con la temperatura absoluta (Thomas &amp; Bentz, 2000; Troconis de Rincón et al., 2011). Costa y Appleton (1999) confirmaron experimentalmente que los perfiles de cloruros en la zona de mareas alcanzan concentraciones superficiales y coeficientes de difusión notablemente mayores que en la zona atmosférica.</w:t>
@@ -1760,6 +1782,7 @@
     <w:p>
       <w:pPr>
         <w:ind w:firstLine="720"/>
+        <w:jc w:val="both"/>
       </w:pPr>
       <w:r>
         <w:t xml:space="preserve">La revisión crítica de Qu et al. (2021) identificó cuatro zonas de exposición marina —atmosférica, de salpicadura, de mareas y sumergida— y estableció que la zona de mareas, en la que el Sistema BEM opera de manera permanente, es la de mayor agresividad: la alternancia de saturación y secado genera un mecanismo de bombeo que introduce cloruros de forma continua y profunda en presencia simultánea de oxígeno, configurando condiciones óptimas para celdas de corrosión de alta velocidad de propagación (Ospina &amp; Sircar, 2019). Ali et al. (2024) confirmaron que la temperatura es la variable aceleradora de primer orden en ambas fases.</w:t>
@@ -1768,6 +1791,7 @@
     <w:p>
       <w:pPr>
         <w:ind w:firstLine="720"/>
+        <w:jc w:val="both"/>
       </w:pPr>
       <w:r>
         <w:t xml:space="preserve">Un aporte especialmente pertinente proviene de Chávez-Ulloa (2013), quien documentó en Venezuela la acción sinérgica entre carbonatación y penetración de cloruros en ambientes marinos tropicales. La caída del pH por carbonatación —desde valores superiores a 12 hasta inferiores a 9, conforme al modelo de Papadakis et al. (1991)— permite que concentraciones de cloruros inferiores al umbral crítico convencional, entre 0,4 </w:t>
@@ -1787,6 +1811,7 @@
     <w:p>
       <w:pPr>
         <w:ind w:firstLine="720"/>
+        <w:jc w:val="both"/>
       </w:pPr>
       <w:r>
         <w:t xml:space="preserve">Mehta (2006) caracterizó el entorno marino tropical como el escenario de mayor agresividad para el concreto armado, por la degradación simultánea de la matriz cementicia —sulfatos, carbonatación y árido-álcali— y del acero por cloruros. Thomas y Bentz (2000) demostraron con Life-365 que la alta temperatura, la humedad sostenida y los ciclos de secado y humedecimiento reducen la vida útil hasta en un 60 %. Val y Stewart (2003) mostraron que la inversión adicional en durabilidad durante el diseño es menor que el costo de las reparaciones que evita, conclusión que el fib (2006) formaliza como diseño por durabilidad con fiabilidad explícita. Neville (2011) y Mehta y Monteiro (2014) coinciden en que los cementantes suplementarios reducen la difusividad de cloruros y prolongan la iniciación bajo exposición tropical severa.</w:t>
@@ -1795,6 +1820,7 @@
     <w:p>
       <w:pPr>
         <w:ind w:firstLine="720"/>
+        <w:jc w:val="both"/>
       </w:pPr>
       <w:r>
         <w:t>Para infraestructuras tipo box culvert como la estudiada, el mecanismo de bombeo de cloruros descrito por Ospina y Sircar (2019) para estructuras portuarias resulta directamente aplicable: saturación durante la pleamar, concentración de la solución de poros durante la bajamar y nueva saturación con cloruros más concentrados en el ciclo siguiente. El ACI 318-19 establece, para la categoría de exposición equivalente a XS3, una resistencia mínima a compresión de 35 MPa, una relación agua/cemento máxima de 0,45, el uso de cementantes resistentes a sulfatos y recubrimientos no inferiores a 50 mm; la NSR-10 recoge criterios equivalentes en el contexto colombiano como condición de diseño de primer orden (ACI Committee 318, 2019; AIS, 2010).</w:t>
@@ -1812,6 +1838,7 @@
     <w:p>
       <w:pPr>
         <w:ind w:firstLine="720"/>
+        <w:jc w:val="both"/>
       </w:pPr>
       <w:r>
         <w:t>El manual Red DURAR-CYTED (1997) es la referencia metodológica regional para la inspección y el diagnóstico de la corrosión en hormigón armado en Iberoamérica, y aporta los criterios de clasificación por niveles de deterioro empleados en este trabajo. Sobre esa base, Olavarrieta, Andrade y Troconis de Rincón (2011) desarrollaron una metodología para ambiente marino tropical que integra inspección visual, potenciales de corrosión, extracción de núcleos y perfiles de cloruros; su aplicación en la costa venezolana documentó daños atribuibles a las mismas causas del BEM: alta permeabilidad, recubrimientos insuficientes y ausencia de mantenimiento. La Universidad del Norte (2018) encontró, en el litoral Caribe colombiano, que incluso concretos de 35 MPa presentan penetración de cloruros significativa, lo que subraya la relevancia del control de la permeabilidad por encima de la especificación de resistencia.</w:t>
@@ -1820,6 +1847,7 @@
     <w:p>
       <w:pPr>
         <w:ind w:firstLine="720"/>
+        <w:jc w:val="both"/>
       </w:pPr>
       <w:r>
         <w:t xml:space="preserve">Oñate López (2022) identificó que una proporción significativa de las obras costeras estratégicas del Caribe colombiano presenta riesgo estructural alto o muy alto, por antigüedad, especificación insuficiente y ausencia de mantenimiento, y argumentó la necesidad de incorporar la durabilidad frente a la corrosión en los modelos de gestión del riesgo; ANALDEX (2024) documenta el rezago de mantenimiento de la infraestructura costera del país. Araujo y Mounzer (2025) aportaron evidencia sobre la velocidad del deterioro en atmósferas extremadamente agresivas —picadura y pérdida acelerada de sección—, patrón coherente con el estado de las compuertas, perfiles angulares y barandas </w:t>
@@ -1839,6 +1867,7 @@
     <w:p>
       <w:pPr>
         <w:ind w:firstLine="720"/>
+        <w:jc w:val="both"/>
       </w:pPr>
       <w:r>
         <w:t>Helene (2003) propone un procedimiento de intervención que parte del diagnóstico patológico integral y avanza hacia la selección del método de reparación, distinguiendo entre refuerzo o restauración —cuando la estructura conserva parte apreciable de su capacidad portante— y demolición y reconstrucción total, indicada cuando el deterioro es irreversible y la relación costo-beneficio de la reparación resulta desfavorable. Broomfield (2007) y Bertolini et al. (2013) sistematizan las técnicas disponibles —parcheo, realcalinización, extracción electroquímica de cloruros, inhibidores, recubrimientos de barrera y protección catódica— y advierten que el parcheo en estructuras con corrosión generalizada induce el efecto de ánodo incipiente, acelerando la corrosión en las zonas adyacentes: limitación decisiva cuando la despasivación afecta a casi todo el refuerzo, como aquí.</w:t>
@@ -1847,6 +1876,7 @@
     <w:p>
       <w:pPr>
         <w:ind w:firstLine="720"/>
+        <w:jc w:val="both"/>
       </w:pPr>
       <w:r>
         <w:t>Tezdogan y Demirel (2014) revisaron los sistemas de protección catódica para estructuras marinas —ánodos de sacrificio y corriente impresa—, señalando que los de corriente impresa son preferibles en estructuras de gran superficie expuesta. El Centro Tecnológico de Componentes (2018) documentó la efectividad de los recubrimientos anticorrosivos para concreto en zona costera, y la literatura reciente de BK Corrosion (2025) subraya que incorporarlos desde el diseño multiplica su efectividad y reduce el costo de ciclo de vida. Para la reconstrucción del BEM la literatura converge en especificaciones mínimas: concreto de al menos 35 MPa con adiciones puzolánicas, cemento resistente a sulfatos, relación agua/cemento no superior a 0,45, recubrimientos de 50 mm o más y protección catódica activa en todos los elementos metálicos (ACI Committee 318, 2019; Bertolini et al., 2013; Helene, 2003).</w:t>
@@ -1864,6 +1894,7 @@
     <w:p>
       <w:pPr>
         <w:ind w:firstLine="720"/>
+        <w:jc w:val="both"/>
       </w:pPr>
       <w:r>
         <w:t>Cuatro hallazgos enmarcan el análisis del caso y constituyen el marco interpretativo con el que se leen los resultados de la campaña: la temperatura media de 30 °C actúa como acelerador cinético de primer orden, reduciendo los tiempos de iniciación hasta en un 50 % respecto de ambientes templados; la zona de mareas es sistemáticamente la más agresiva, por la amplificación del ingreso de cloruros mediante ciclos de saturación y secado; los concretos de permeabilidad insuficiente presentan vidas útiles incompatibles con la exposición XS3; y la ausencia de mantenimiento preventivo transforma patologías incipientes en daños irreversibles.</w:t>
@@ -1881,6 +1912,7 @@
     <w:p>
       <w:pPr>
         <w:ind w:firstLine="720"/>
+        <w:jc w:val="both"/>
       </w:pPr>
       <w:r>
         <w:t xml:space="preserve">La investigación adoptó un diseño mixto de alcance descriptivo-analítico y estrategia de estudio de caso único, en línea con las metodologías para ambiente marino tropical de Red DURAR-CYTED (1997) y Olavarrieta et al. (2011). El componente cuantitativo comprendió el procesamiento estadístico de los ensayos de materiales y el cálculo de la resistencia efectiva conforme al capítulo A.10 de la NSR-10. El cualitativo abarcó la sistematización de la inspección visual por vano y elemento y el análisis de causas y efectos según Helene (2003), con la comparación normativa entre NSR-98, NSR-10 y ACI 318-19. El estudio </w:t>
@@ -1984,6 +2016,7 @@
     <w:p>
       <w:pPr>
         <w:ind w:firstLine="720"/>
+        <w:jc w:val="both"/>
       </w:pPr>
       <w:r>
         <w:t xml:space="preserve">La estructura evaluada es el puente de celdas de compuertas del Sistema BEM, en el sector La Bocana de Cartagena de Indias: un box culvert de diez compartimientos en concreto reforzado, iniciado en 1999 e inaugurado en 2000, sumergido unos 3,00 m al momento de la inspección. La temperatura media del municipio es de 30 °C y el estudio geotécnico reporta perfil de suelo tipo D con nivel freático entre 0,50 m y 1,00 m. El ambiente de exposición corresponde a la zona de mareas y salpicaduras, clasificable como XS3 según EN 206-1 y EHE-08 y como categoría C2 en la Tabla 19.3.1.1 del ACI 318-19, con presencia simultánea de cloruros marinos y sulfatos de la Ciénaga de la Virgen.</w:t>
@@ -2001,6 +2034,7 @@
     <w:p>
       <w:pPr>
         <w:ind w:firstLine="720"/>
+        <w:jc w:val="both"/>
       </w:pPr>
       <w:r>
         <w:t>Los instrumentos aplicados se seleccionaron en función del acceso real a la estructura, de la posibilidad de ejecutarlos sin interrumpir la operación hidráulica del sistema y de su capacidad para caracterizar con rigor el estado del concreto y del acero de refuerzo. La campaña fue planificada y dirigida por el autor, quien definió los puntos de medición, los criterios de selección de las zonas de extracción y el alcance de la inspección visual. Para su ejecución material se contrataron servicios especializados de laboratorio de materiales y equipos de medición —esclerómetro, extractora de núcleos, escáner electromagnético de refuerzo y prensa de compresión—, así como apoyo de buceo técnico para la inspección subacuática. La Tabla 1 sintetiza el conjunto de instrumentos.</w:t>
@@ -2687,6 +2721,7 @@
     <w:p>
       <w:pPr>
         <w:spacing w:before="80" w:after="220"/>
+        <w:jc w:val="both"/>
       </w:pPr>
       <w:r>
         <w:rPr>
@@ -2712,6 +2747,7 @@
     <w:p>
       <w:pPr>
         <w:ind w:firstLine="720"/>
+        <w:jc w:val="both"/>
       </w:pPr>
       <w:r>
         <w:t xml:space="preserve">Los datos cuantitativos se procesaron mediante estadística descriptiva, con el fin de caracterizar la magnitud y la dispersión de la resistencia del concreto entre los puntos de extracción. La resistencia efectiva del concreto se determinó conforme al numeral A.10.4.3.4 de la NSR-10, mediante la expresión f'ce = f'c,prom × φc × φe, donde f'c,prom corresponde al promedio de las resistencias a compresión de los núcleos extraídos, φc es el coeficiente de calidad del diseño y la construcción y φe el coeficiente de estado de la edificación, ambos asignados según la Tabla A.10.4-1 de la misma norma. El número mínimo de ensayos se verificó conforme al numeral A.10.4.3.3.</w:t>
@@ -2720,6 +2756,7 @@
     <w:p>
       <w:pPr>
         <w:ind w:firstLine="720"/>
+        <w:jc w:val="both"/>
       </w:pPr>
       <w:r>
         <w:t xml:space="preserve">El análisis cualitativo de causas y efectos siguió la metodología de Helene (2003), articulando los factores de deterioro —ambiente de exposición, calidad del material, recubrimientos y régimen de mantenimiento— con las manifestaciones patológicas observadas en cada vano. La comparación normativa cuantificó la brecha entre las exigencias de la NSR-98, vigente en la época de construcción, y los requisitos de durabilidad de la NSR-10 y del ACI 318-19 para exposición marina severa, en términos de resistencia mínima, relación agua/cemento y recubrimientos. Finalmente, </w:t>
@@ -2839,6 +2876,7 @@
     <w:p>
       <w:pPr>
         <w:ind w:firstLine="720"/>
+        <w:jc w:val="both"/>
       </w:pPr>
       <w:r>
         <w:t>La información primaria de este artículo procede de la campaña de inspección y diagnóstico patológico adelantada sobre la estructura de compuertas del Sistema BEM entre noviembre de 2024 y abril de 2025, planificada y dirigida por el autor en el marco de su ejercicio profesional como ingeniero civil. La documentación histórica de diseño y construcción —archivo «Ministerio de Transporte 01-4167-05 Bocana Estabilizador»— fue suministrada por el área técnica del EPA. Los resultados se presentan en forma agregada y con fines exclusivamente técnicos y académicos, sin incorporar información contractual, económica ni de terceros ajena al objeto del estudio. El aporte original del presente artículo consiste en la sistematización, el análisis interpretativo y la contrastación normativa y bibliográfica de los datos de campo, no en su mera recopilación.</w:t>
@@ -2865,6 +2903,7 @@
     <w:p>
       <w:pPr>
         <w:ind w:firstLine="720"/>
+        <w:jc w:val="both"/>
       </w:pPr>
       <w:r>
         <w:t xml:space="preserve">El levantamiento en campo permitió establecer que la infraestructura está conformada por una losa de cimentación cuyo ancho supera en 0,30 m la longitud de los muros de apoyo a cada lado, verificada mediante inspección subacuática. La gran cantidad de sedimentos acumulados en el fondo impidió determinar su espesor real y constatar su estado de conservación; los planos históricos del archivo del Ministerio de Transporte </w:t>
@@ -2875,6 +2914,7 @@
     <w:p>
       <w:pPr>
         <w:ind w:firstLine="720"/>
+        <w:jc w:val="both"/>
       </w:pPr>
       <w:r>
         <w:t xml:space="preserve">La superestructura está compuesta por muros de apoyo de concreto reforzado con espesor variable entre 0,80 m y 2,40 m, longitud de 15,70 m y una altura libre de 5,00 m entre la losa de fondo y la cara inferior de las vigas del tablero. El tablero se resuelve mediante tres vigas de sección rectangular de 0,35 m × 1,00 m y una losa maciza de 0,30 m de espesor. El armado verificado por elemento se consigna en la Tabla </w:t>
@@ -2896,6 +2936,7 @@
     <w:p>
       <w:pPr>
         <w:ind w:firstLine="720"/>
+        <w:jc w:val="both"/>
       </w:pPr>
       <w:r>
         <w:t>Para el acero de refuerzo se adoptó como valor de referencia un esfuerzo de fluencia de 420 MPa, decisión sustentada en que la NSR-98 se encontraba vigente al momento de la construcción y en que las actas de obra del archivo histórico registran el pago de acero con esa especificación. Para el concreto, en cambio, no se hallaron especificaciones documentadas correspondientes a la estructura de compuertas —únicamente las del box culvert de la avenida principal, ajeno a este estudio—, lo que obligó a establecer su calidad exclusivamente por vía experimental.</w:t>
@@ -2913,6 +2954,7 @@
     <w:p>
       <w:pPr>
         <w:ind w:firstLine="720"/>
+        <w:jc w:val="both"/>
       </w:pPr>
       <w:r>
         <w:t>La inspección visual sistemática de los diez vanos permitió construir el inventario de manifestaciones patológicas que sintetiza la Figura 1. El patrón dominante es la corrosión generalizada del acero de refuerzo con desprendimiento del recubrimiento, acompañada de agrietamiento del concreto en muros, losa y vigas, y de oxidación avanzada de la totalidad de los elementos metálicos. La severidad no se distribuye de manera homogénea: los vanos 1 a 6 concentran las manifestaciones más críticas, incluidas las fallas por cortante en vigas, mientras que los vanos 7 a 10 presentan predominio de sulfatación, eflorescencias, humedades y erosión superficial del concreto.</w:t>
@@ -2994,6 +3036,7 @@
     <w:p>
       <w:pPr>
         <w:spacing w:before="80" w:after="220"/>
+        <w:jc w:val="both"/>
       </w:pPr>
       <w:r>
         <w:rPr>
@@ -3010,6 +3053,7 @@
     <w:p>
       <w:pPr>
         <w:ind w:firstLine="720"/>
+        <w:jc w:val="both"/>
       </w:pPr>
       <w:r>
         <w:t>La matriz revela un patrón de distribución relevante: las manifestaciones asociadas a pérdida de capacidad estructural —corrosión del refuerzo, desprendimiento del recubrimiento y falla por cortante— se concentran en los vanos 1 a 6, mientras que en los vanos 7 a 10 predominan las asociadas al transporte de agua y sales. Cuatro mecanismos, en cambio, se presentan de forma generalizada: corrosión de elementos metálicos, eflorescencias y estalactitas en la cara inferior de la losa, bioincrustación marina y reacción árido-álcali. Esta coexistencia de un gradiente longitudinal con un fondo de deterioro uniforme sugiere que la agresividad ambiental actúa homogéneamente sobre toda la estructura, mientras que la manifestación estructural del daño depende de condiciones locales de recubrimiento, porosidad y exposición al oleaje.</w:t>
@@ -3018,6 +3062,7 @@
     <w:p>
       <w:pPr>
         <w:ind w:firstLine="720"/>
+        <w:jc w:val="both"/>
       </w:pPr>
       <w:r>
         <w:t xml:space="preserve">Las eflorescencias y estalactitas observadas en la cara inferior de la losa constituyen evidencia directa de que el concreto se encuentra poroso y fracturado en todo su espesor, ya que su formación exige un flujo continuo de agua a través de la sección que arrastra y precipita sales solubles. De manera complementaria, la reacción árido-álcali detectada en la superficie superior de la losa indica un mecanismo de degradación de la matriz cementicia independiente de la corrosión del refuerzo, que se suma a los efectos de la carbonatación y del ataque por sulfatos.</w:t>
@@ -3035,6 +3080,7 @@
     <w:p>
       <w:pPr>
         <w:ind w:firstLine="720"/>
+        <w:jc w:val="both"/>
       </w:pPr>
       <w:r>
         <w:t>La esclerometría se ejecutó el 9 de diciembre de 2024 sobre cuatro referencias —muros de aleta, losa del tablero en dos posiciones y pilar 8—, con dieciséis puntos de medición por referencia, superficie lisa e inclinación del equipo de −90°. La Tabla 2 resume los resultados obtenidos.</w:t>
@@ -3730,6 +3776,7 @@
     <w:p>
       <w:pPr>
         <w:spacing w:before="80" w:after="220"/>
+        <w:jc w:val="both"/>
       </w:pPr>
       <w:r>
         <w:rPr>
@@ -3758,6 +3805,7 @@
     <w:p>
       <w:pPr>
         <w:ind w:firstLine="720"/>
+        <w:jc w:val="both"/>
       </w:pPr>
       <w:r>
         <w:t>Las cuatro referencias fueron formalmente descartadas. Las razones consignadas en los formatos convergen: las lecturas fuera del rango de ±6 unidades respecto del promedio exceden en todos los casos el máximo admisible de dos —nueve y catorce en ES-1 y ES-2—; los recubrimientos reales superan los 7 cm en varios puntos; y los números de rebote resultan anormalmente altos, con anotación expresa de posible carbonatación.</w:t>
@@ -3766,6 +3814,7 @@
     <w:p>
       <w:pPr>
         <w:ind w:firstLine="720"/>
+        <w:jc w:val="both"/>
       </w:pPr>
       <w:r>
         <w:lastRenderedPageBreak/>
@@ -3848,6 +3897,7 @@
     <w:p>
       <w:pPr>
         <w:spacing w:before="80" w:after="220"/>
+        <w:jc w:val="both"/>
       </w:pPr>
       <w:r>
         <w:rPr>
@@ -3863,6 +3913,7 @@
     <w:p>
       <w:pPr>
         <w:ind w:firstLine="720"/>
+        <w:jc w:val="both"/>
       </w:pPr>
       <w:r>
         <w:t>La divergencia entre ambos métodos constituye una corroboración independiente del diagnóstico de carbonatación, obtenida por una vía distinta de la fenolftaleína y coherente con ella, y confirma que el número de rebote resulta inadecuado en estructuras con carbonatación avanzada. En consecuencia, la caracterización del material se sustentó exclusivamente en el ensayo a compresión de núcleos, cuyos resultados presenta la Tabla 3.</w:t>
@@ -3871,6 +3922,7 @@
     <w:p>
       <w:pPr>
         <w:ind w:firstLine="720"/>
+        <w:jc w:val="both"/>
       </w:pPr>
       <w:r>
         <w:t>Los cinco núcleos se extrajeron en zonas consideradas sanas por necesidad operativa, dado que en amplios sectores el concreto se desintegraba por la sola acción de la broca del extractor, de modo que los valores obtenidos deben interpretarse como una cota superior de la calidad real del material en el conjunto de la estructura.</w:t>
@@ -4647,6 +4699,7 @@
     <w:p>
       <w:pPr>
         <w:spacing w:before="80" w:after="220"/>
+        <w:jc w:val="both"/>
       </w:pPr>
       <w:r>
         <w:rPr>
@@ -4662,6 +4715,7 @@
     <w:p>
       <w:pPr>
         <w:ind w:firstLine="720"/>
+        <w:jc w:val="both"/>
       </w:pPr>
       <w:r>
         <w:t>Los cinco especímenes fueron extraídos de un mismo elemento —la losa maciza del tablero, de 0,30 m de espesor—, de modo que las diferencias entre ellos no son atribuibles a distintos tipos de elemento, a distintas zonas de exposición ni a distintas edades de fundición. Ello permite tratar el conjunto como una muestra de un material nominalmente homogéneo y someterlo a un tratamiento estadístico descriptivo cuyos resultados se presentan en la Tabla 4.</w:t>
@@ -5525,6 +5579,7 @@
     <w:p>
       <w:pPr>
         <w:spacing w:before="80" w:after="220"/>
+        <w:jc w:val="both"/>
       </w:pPr>
       <w:r>
         <w:rPr>
@@ -5541,6 +5596,7 @@
     <w:p>
       <w:pPr>
         <w:ind w:firstLine="720"/>
+        <w:jc w:val="both"/>
       </w:pPr>
       <w:r>
         <w:t>La dispersión obtenida constituye, por sí misma, un hallazgo. Un coeficiente de variación del 26,7 % sobre un mismo elemento estructural supera ampliamente los rangos que la práctica reconocida asocia a un control de calidad aceptable —del orden del 15 % o inferior para concreto colocado en obra—, e incluso descontando la variabilidad adicional propia del ensayo de núcleos frente al de cilindros moldeados, el valor sigue siendo elevado. Más aún, el valor máximo duplica al mínimo, y el núcleo N-2 arroja 1.008 PSI, prácticamente coincidente con la resistencia efectiva finalmente adoptada para toda la estructura. El material, por tanto, no se ha degradado de manera uniforme: dentro de una misma losa coexisten zonas con el doble de resistencia que otras.</w:t>
@@ -5549,6 +5605,7 @@
     <w:p>
       <w:pPr>
         <w:ind w:firstLine="720"/>
+        <w:jc w:val="both"/>
       </w:pPr>
       <w:r>
         <w:t>Esta heterogeneidad es coherente con el mecanismo de deterioro identificado. Si la pérdida de resistencia obedeciera a una deficiencia de dosificación originaria, cabría esperar dispersión moderada en torno a una media baja, propia de la variabilidad de producción de un premezclado. La observada responde al patrón de un material cuya degradación está gobernada por variables locales: espesor real del recubrimiento, porosidad de la pasta, fisuras que facilitan el transporte de agua y sales, y exposición al oleaje y a los ciclos de humedecimiento y secado. Dado que los núcleos se extrajeron en zonas sanas, la dispersión real del conjunto es necesariamente mayor que la aquí cuantificada.</w:t>
@@ -5557,6 +5614,7 @@
     <w:p>
       <w:pPr>
         <w:ind w:firstLine="720"/>
+        <w:jc w:val="both"/>
       </w:pPr>
       <w:r>
         <w:t>Cabe precisar una limitación en este punto: los núcleos se identificaron por elemento —losa del tablero— y no por vano, de modo que no es posible correlacionar estadísticamente la resistencia puntual con el inventario de patologías de la Figura 1. La asociación entre los vanos de mayor severidad y las zonas de menor resistencia permanece como inferencia cualitativa, no como correlación demostrada; una campaña futura debería georreferenciar cada extracción por vano.</w:t>
@@ -5565,6 +5623,7 @@
     <w:p>
       <w:pPr>
         <w:ind w:firstLine="720"/>
+        <w:jc w:val="both"/>
       </w:pPr>
       <w:r>
         <w:t xml:space="preserve">El promedio de 1.674 PSI (11,6 MPa) se sitúa un 44 % por debajo del mínimo de 3.000 PSI que el capítulo C.21 de la NSR-10 establece para concreto estructural, y un 58 % por debajo de los 4.000 PSI que, conforme al numeral C.4 de la NSR-98 vigente en la época de construcción, correspondía recomendar para este tipo de estructura considerando que el concreto empleado fue premezclado y que, por tanto, los controles de dosificación eran comparativamente más precisos. La dispersión entre muestras es considerable —el valor máximo duplica al mínimo—, lo que resulta coherente con un material cuya degradación no es uniforme sino gobernada por la variabilidad local del recubrimiento, de la porosidad y de la exposición directa al agua.</w:t>
@@ -5573,6 +5632,7 @@
     <w:p>
       <w:pPr>
         <w:ind w:firstLine="720"/>
+        <w:jc w:val="both"/>
       </w:pPr>
       <w:r>
         <w:t>Los ensayos de carbonatación se ejecutaron aplicando fenolftaleína sobre las superficies de fractura de los cinco núcleos. El indicador vira a púrpura con pH superior a 9, es decir, cuando el concreto conserva reserva alcalina. Ninguno de los especímenes viró en punto alguno de su longitud, de 15 a 20 cm: el concreto está totalmente carbonatado en todo el espesor de los elementos ensayados, sin núcleo alcalino capaz de mantener pasivado el refuerzo. El hallazgo es consistente con la corrosión generalizada observada in situ y explica las bajas resistencias, pues la carbonatación avanzada, junto con el ataque por sulfatos, degrada la microestructura de la pasta e incrementa la porosidad.</w:t>
@@ -5590,6 +5650,7 @@
     <w:p>
       <w:pPr>
         <w:ind w:firstLine="720"/>
+        <w:jc w:val="both"/>
       </w:pPr>
       <w:r>
         <w:lastRenderedPageBreak/>
@@ -5599,6 +5660,7 @@
     <w:p>
       <w:pPr>
         <w:ind w:firstLine="720"/>
+        <w:jc w:val="both"/>
       </w:pPr>
       <w:r>
         <w:t>De esta calificación resultan los coeficientes φc = 1,0 y φe = 0,6. Aplicando la expresión del numeral A.10.4.3.4 de la NSR-10, la resistencia efectiva del concreto de la estructura es:</w:t>
@@ -5842,6 +5904,7 @@
     <w:p>
       <w:pPr>
         <w:ind w:firstLine="720"/>
+        <w:jc w:val="both"/>
       </w:pPr>
       <w:r>
         <w:t>La Tabla 5 contrasta este valor con las exigencias normativas aplicables, y hace explícita la magnitud de la brecha.</w:t>
@@ -6417,6 +6480,7 @@
     <w:p>
       <w:pPr>
         <w:spacing w:before="80" w:after="220"/>
+        <w:jc w:val="both"/>
       </w:pPr>
       <w:r>
         <w:rPr>
@@ -6538,6 +6602,7 @@
     <w:p>
       <w:pPr>
         <w:ind w:firstLine="720"/>
+        <w:jc w:val="both"/>
       </w:pPr>
       <w:r>
         <w:t xml:space="preserve">Para valorar la vulnerabilidad sísmica conforme al capítulo A.10 de la NSR-10 se definieron las cargas actuantes. La carga muerta toma el peso propio de muros, losa y vigas con peso específico de 22,5 kN/m³, consistente con los ensayos de compresión, más 0,21 kN/ml de barandas sobre el voladizo, único aporte adicional por carecer el tablero de revestimiento. Como carga viva se adoptaron 3,60 kN/m² sobre la losa</w:t>
@@ -6588,6 +6653,7 @@
     <w:p>
       <w:pPr>
         <w:ind w:firstLine="720"/>
+        <w:jc w:val="both"/>
       </w:pPr>
       <w:r>
         <w:t>Los parámetros sísmicos se establecieron a partir de la localización de la estructura y de su clasificación como grupo de uso II, conforme al inciso (f) del numeral A.2.5.1.3 de la NSR-10. Cartagena de Indias se ubica en zona de amenaza sísmica baja. La Tabla 6 resume los parámetros adoptados.</w:t>
@@ -7274,6 +7340,7 @@
     <w:p>
       <w:pPr>
         <w:spacing w:before="80" w:after="220"/>
+        <w:jc w:val="both"/>
       </w:pPr>
       <w:r>
         <w:rPr>
@@ -7289,6 +7356,7 @@
     <w:p>
       <w:pPr>
         <w:ind w:firstLine="720"/>
+        <w:jc w:val="both"/>
       </w:pPr>
       <w:r>
         <w:t xml:space="preserve">La metodología prevista contemplaba un modelo matemático espacial con seis grados de libertad por nodo, idealizando muros, losa y vigas unidos por diafragmas rígidos, para determinar por análisis dinámico los índices de sobreesfuerzo y flexibilidad. La evidencia de campo </w:t>
@@ -7375,6 +7443,7 @@
     <w:p>
       <w:pPr>
         <w:ind w:firstLine="720"/>
+        <w:jc w:val="both"/>
       </w:pPr>
       <w:r>
         <w:t xml:space="preserve">En consecuencia, no se calcularon índices de sobreesfuerzo</w:t>
@@ -7713,6 +7782,7 @@
     <w:p>
       <w:pPr>
         <w:ind w:firstLine="720"/>
+        <w:jc w:val="both"/>
       </w:pPr>
       <w:r>
         <w:t xml:space="preserve">La inspección visual no evidenció asentamientos diferenciales entre apoyos, lo que permite descartar el comportamiento del suelo de fundación como causa del cuadro patológico. Del mismo modo, las afectaciones observadas no son atribuibles a insuficiencia de la capacidad resistente de diseño de los elementos: la configuración geométrica y el armado verificados en campo resultan consistentes con la función estructural prevista. El deterioro se explica, en cambio, por la degradación del material y del refuerzo bajo la acción sostenida del ambiente marino. La calidad del diseño se estableció como buena y la conservación y el mantenimiento como malos, combinación que sintetiza el hallazgo central del estudio: una estructura correctamente concebida y ejecutada, pero especificada bajo criterios de durabilidad insuficientes para su ambiente y operada durante veinticinco años sin mantenimiento preventivo.</w:t>
@@ -7721,6 +7791,7 @@
     <w:p>
       <w:pPr>
         <w:ind w:firstLine="720"/>
+        <w:jc w:val="both"/>
       </w:pPr>
       <w:r>
         <w:t xml:space="preserve">La vulnerabilidad se califica</w:t>
@@ -7770,6 +7841,7 @@
     <w:p>
       <w:pPr>
         <w:ind w:firstLine="720"/>
+        <w:jc w:val="both"/>
       </w:pPr>
       <w:r>
         <w:t>Los resultados permiten leer el caso como una verificación empírica, en el Caribe colombiano, del modelo bilineal de Tuutti (1982). La fase de iniciación, que en un concreto bien especificado para exposición XS3 debería durar varias décadas, se agotó pronto por tres condiciones concurrentes: permeabilidad incompatible con la exposición, recubrimientos insuficientes frente a un material poroso y una temperatura media de 30 °C que multiplica los coeficientes de difusión iónica respecto de los ambientes templados donde se calibraron los modelos de referencia (Thomas &amp; Bentz, 2000; Troconis de Rincón et al., 2011). La propagación no encontró restricción: la ausencia de mantenimiento durante veinticinco años permitió que el ciclo de fisuración, desprendimiento y exposición del acero se retroalimentara sin interrupción.</w:t>
@@ -7778,6 +7850,7 @@
     <w:p>
       <w:pPr>
         <w:ind w:firstLine="720"/>
+        <w:jc w:val="both"/>
       </w:pPr>
       <w:r>
         <w:lastRenderedPageBreak/>
@@ -7860,6 +7933,7 @@
     <w:p>
       <w:pPr>
         <w:spacing w:before="80" w:after="220"/>
+        <w:jc w:val="both"/>
       </w:pPr>
       <w:r>
         <w:rPr>
@@ -7875,6 +7949,7 @@
     <w:p>
       <w:pPr>
         <w:ind w:firstLine="720"/>
+        <w:jc w:val="both"/>
       </w:pPr>
       <w:r>
         <w:t xml:space="preserve">De esta ubicación se desprende una consecuencia metodológica. Los modelos de predicción de vida útil</w:t>
@@ -8108,6 +8183,7 @@
     <w:p>
       <w:pPr>
         <w:ind w:firstLine="720"/>
+        <w:jc w:val="both"/>
       </w:pPr>
       <w:r>
         <w:t xml:space="preserve">La campaña no midió la densidad de corriente de corrosión conforme a la ASTM C876 ni por resistencia de polarización, por lo que no se dispone de un valor medido de icorr. No obstante, la clase de exposición caracterizada y el estado del concreto verificado experimentalmente permiten aplicar el marco empírico de Andrade y Alonso (2001), </w:t>
@@ -8118,6 +8194,7 @@
     <w:p>
       <w:pPr>
         <w:ind w:firstLine="720"/>
+        <w:jc w:val="both"/>
       </w:pPr>
       <w:r>
         <w:t xml:space="preserve">Para un concreto totalmente carbonatado, de elevada porosidad, en presencia simultánea de cloruros y con ciclos permanentes de humedecimiento y secado —es decir, con disponibilidad continua de electrolito y de oxígeno—, la literatura sitúa la velocidad de corrosión en el nivel alto de esa clasificación. Adoptando como hipótesis conservadora un valor sostenido de 1 µA/cm², y asumiendo que la despasivación ocurrió en el entorno del primer quinto de la vida de servicio, la pérdida uniforme acumulada resultaría del orden expuesto en la Tabla 7.</w:t>
@@ -8893,6 +8970,7 @@
     <w:p>
       <w:pPr>
         <w:spacing w:before="80" w:after="220"/>
+        <w:jc w:val="both"/>
       </w:pPr>
       <w:r>
         <w:rPr>
@@ -8908,6 +8986,7 @@
     <w:p>
       <w:pPr>
         <w:ind w:firstLine="720"/>
+        <w:jc w:val="both"/>
       </w:pPr>
       <w:r>
         <w:t xml:space="preserve">Dos lecturas se derivan de este ejercicio. La primera concierne al tiempo de fisuración: con una velocidad de corrosión del nivel alto, la penetración de ataque necesaria para fisurar el recubrimiento se alcanza en un plazo del orden de dos a cuatro años contados desde la despasivación. Esto explica de manera directa por qué, sobre una vida de servicio de veinticinco años, el desprendimiento del recubrimiento no es un fenómeno localizado sino una condición generalizada: una vez agotada la reserva alcalina, la fisuración del recubrimiento es cuestión de pocos años, y a partir de ese momento el acero queda expuesto al ambiente sin barrera alguna, lo que acelera el proceso de manera irreversible.</w:t>
@@ -8916,6 +8995,7 @@
     <w:p>
       <w:pPr>
         <w:ind w:firstLine="720"/>
+        <w:jc w:val="both"/>
       </w:pPr>
       <w:r>
         <w:t xml:space="preserve">La segunda lectura es que el modelo uniforme subestima el daño real: una pérdida de área del 4 % al 7 % es incompatible con la corrosión total de las barras inferiores de las vigas y de los muros centrales. La discrepancia no invalida la estimación, la señala como cota inferior y revela mecanismos que el modelo no captura: picadura, que concentra la pérdida en puntos discretos; pérdida completa del recubrimiento, que expone la barra a corrosión atmosférica directa; y desaparición de la adherencia, que anula la transferencia de esfuerzos con independencia de la sección remanente. Esta última es la determinante: una barra con el 90 % de su sección pero sin adherencia ni confinamiento no aporta capacidad, lo que </w:t>
@@ -8977,6 +9057,7 @@
     <w:p>
       <w:pPr>
         <w:ind w:firstLine="720"/>
+        <w:jc w:val="both"/>
         <w:rPr>
           <w:ins w:id="9469" w:author="Luis David Arroyo Anaya" w:date="2026-10-10T18:00:00Z"/>
         </w:rPr>
@@ -10172,6 +10253,7 @@
     <w:p>
       <w:pPr>
         <w:spacing w:before="80" w:after="220"/>
+        <w:jc w:val="both"/>
         <w:rPr>
           <w:ins w:id="9475" w:author="Luis David Arroyo Anaya" w:date="2026-10-10T18:00:00Z"/>
         </w:rPr>
@@ -10194,6 +10276,7 @@
     <w:p>
       <w:pPr>
         <w:ind w:firstLine="720"/>
+        <w:jc w:val="both"/>
         <w:rPr>
           <w:ins w:id="9478" w:author="Luis David Arroyo Anaya" w:date="2026-10-10T18:00:00Z"/>
         </w:rPr>
@@ -10207,6 +10290,7 @@
     <w:p>
       <w:pPr>
         <w:ind w:firstLine="720"/>
+        <w:jc w:val="both"/>
         <w:rPr>
           <w:ins w:id="9480" w:author="Luis David Arroyo Anaya" w:date="2026-10-10T18:00:00Z"/>
         </w:rPr>
@@ -10234,6 +10318,7 @@
     <w:p>
       <w:pPr>
         <w:ind w:firstLine="720"/>
+        <w:jc w:val="both"/>
       </w:pPr>
       <w:r>
         <w:t xml:space="preserve">El hallazgo más significativo es la carbonatación total de los cinco núcleos en longitudes de 15 a 20 cm, que confirma en campo el mecanismo sinérgico descrito por Chávez-Ulloa (2013): en ambientes marinos tropicales, carbonatación y penetración de cloruros no operan como procesos alternativos sino acoplados. La pérdida completa de la reserva alcalina elimina la protección electroquímica descrita por Page y Treadaway (1982) y reduce el umbral crítico de cloruros necesario para la despasivación, de modo que la corrosión se generaliza en lugar de concentrarse en picaduras localizadas. Ello es plenamente coherente con la corrosión total del refuerzo observada en los muros centrales y en las barras inferiores de las vigas, y valida la interpretación de que ambos fenómenos son manifestaciones de un mismo proceso.</w:t>
@@ -10242,6 +10327,7 @@
     <w:p>
       <w:pPr>
         <w:ind w:firstLine="720"/>
+        <w:jc w:val="both"/>
       </w:pPr>
       <w:r>
         <w:t xml:space="preserve">Un segundo elemento de discusión concierne a la relación entre carbonatación y resistencia. En condiciones ordinarias la carbonatación densifica la superficie y puede elevar levemente la resistencia superficial; en el BEM ocurre lo opuesto, con resistencias medias de 11,6 MPa. La explicación más consistente es que la carbonatación no actuó aislada, sino sobre una matriz previamente degradada por el ataque de sulfatos de la ciénaga y por la reacción árido-álcali de la cara superior de la losa, mecanismos que Mehta (2006) identifica como propios del entorno marino tropical. El resultado es un material poroso, cuyas eflorescencias y estalactitas evidencian flujo continuo de agua a través de la sección. La baja resistencia es consecuencia y no causa del cuadro patológico: la estructura no falló por un concreto insuficiente para las solicitaciones, sino porque el ambiente destruyó progresivamente el material especificado.</w:t>
@@ -10250,6 +10336,7 @@
     <w:p>
       <w:pPr>
         <w:ind w:firstLine="720"/>
+        <w:jc w:val="both"/>
       </w:pPr>
       <w:r>
         <w:t>La cuantificación de la brecha normativa es el aporte de mayor transferibilidad del estudio. La resistencia efectiva de 1.004,4 PSI representa el 20 % de los 35 MPa exigidos para exposición marina severa. La comparación debe leerse con precisión: la NSR-98 no fijaba requisitos por categoría de exposición, pero sí recomendaba en su numeral C.4 un mínimo de 4.000 PSI para este tipo de estructura. La brecha no se produce solo entre normas sucesivas, sino entre lo que la norma de la época sugería y lo que se ejecutó. La distinción importa para la práctica profesional colombiana: la insuficiencia normativa y la de la especificación de proyecto son problemas distintos, y la segunda persiste aunque se corrija la primera. La evidencia de la Universidad del Norte (2018) lo refuerza: la resistencia a compresión es un indicador insuficiente de durabilidad frente al control de la permeabilidad mediante adiciones minerales (Mehta &amp; Monteiro, 2014; Neville, 2011).</w:t>
@@ -10258,6 +10345,7 @@
     <w:p>
       <w:pPr>
         <w:ind w:firstLine="720"/>
+        <w:jc w:val="both"/>
       </w:pPr>
       <w:r>
         <w:t xml:space="preserve">La decisión de no construir el modelo matemático </w:t>
@@ -10581,6 +10669,7 @@
     <w:p>
       <w:pPr>
         <w:ind w:firstLine="720"/>
+        <w:jc w:val="both"/>
       </w:pPr>
       <w:r>
         <w:lastRenderedPageBreak/>
@@ -10590,6 +10679,7 @@
     <w:p>
       <w:pPr>
         <w:ind w:firstLine="720"/>
+        <w:jc w:val="both"/>
       </w:pPr>
       <w:r>
         <w:t xml:space="preserve">Conviene finalmente precisar las limitaciones del estudio. La campaña no incluyó perfiles de cloruros por profundidad ni medición de potenciales de corrosión conforme a la ASTM C876, ensayos que habrían permitido cuantificar directamente el contenido de cloruros y la velocidad de corrosión en lugar de estimarla. Tampoco fue posible verificar el estado de la losa de cimentación ni de las superficies permanentemente sumergidas, por la acumulación de sedimentos, ni correlacionar la resistencia de los núcleos con el vano de procedencia. </w:t>
@@ -10761,6 +10851,7 @@
     <w:p>
       <w:pPr>
         <w:ind w:firstLine="720"/>
+        <w:jc w:val="both"/>
       </w:pPr>
       <w:r>
         <w:t xml:space="preserve">El ambiente marino tropical de Cartagena de Indias —temperatura media de 30 °C, humedad relativa sostenida y presencia simultánea de cloruros marinos y sulfatos procedentes de la Ciénaga de la Virgen— produjo sobre las compuertas del Sistema BEM un deterioro que agotó su vida útil </w:t>
@@ -10782,6 +10873,7 @@
     <w:p>
       <w:pPr>
         <w:ind w:firstLine="720"/>
+        <w:jc w:val="both"/>
       </w:pPr>
       <w:r>
         <w:t xml:space="preserve">Los mecanismos de deterioro documentados en los diez vanos son la corrosión generalizada del refuerzo inducida por cloruros, la carbonatación total del concreto, el ataque por sulfatos con eflorescencias, la reacción árido-álcali en la cara superior de la losa, la erosión hidráulica, la bioincrustación marina y la corrosión avanzada de la totalidad de los elementos metálicos. El cuadro se manifiesta estructuralmente en agrietamiento generalizado, desprendimiento total del recubrimiento y fallas por cortante en las vigas de los vanos 3, 5 y 6.</w:t>
@@ -10790,6 +10882,7 @@
     <w:p>
       <w:pPr>
         <w:ind w:firstLine="720"/>
+        <w:jc w:val="both"/>
       </w:pPr>
       <w:r>
         <w:t xml:space="preserve">La </w:t>
@@ -10824,6 +10917,7 @@
     <w:p>
       <w:pPr>
         <w:ind w:firstLine="720"/>
+        <w:jc w:val="both"/>
       </w:pPr>
       <w:r>
         <w:t xml:space="preserve">La resistencia efectiva del concreto, calculada conforme al numeral A.10.4.3.4 de la NSR-10 a partir de un promedio de 1.674 PSI y de los coeficientes φc = 1,0 y φe = 0,6, es de 1.004,4 PSI (6,9 MPa): el 33 % del mínimo de la NSR-10 para concreto estructural, el 25 % de lo que la NSR-98 recomendaba para este tipo de estructura y el 20 % de lo exigido para exposición marina severa. La brecha normativa no se produce únicamente entre </w:t>
@@ -10834,6 +10928,7 @@
     <w:p>
       <w:pPr>
         <w:ind w:firstLine="720"/>
+        <w:jc w:val="both"/>
         <w:rPr>
           <w:ins w:id="9484" w:author="Luis David Arroyo Anaya" w:date="2026-10-10T18:00:00Z"/>
         </w:rPr>
@@ -10847,6 +10942,7 @@
     <w:p>
       <w:pPr>
         <w:ind w:firstLine="720"/>
+        <w:jc w:val="both"/>
       </w:pPr>
       <w:r>
         <w:t>La calidad del diseño y de la construcción se establece como buena y la conservación y el mantenimiento como malos. El deterioro no es atribuible a errores de concepción estructural ni a asentamientos diferenciales, sino a la especificación de un material inadecuado para la agresividad real del ambiente y a la ausencia de mantenimiento preventivo durante toda la vida de servicio.</w:t>
@@ -10855,6 +10951,7 @@
     <w:p>
       <w:pPr>
         <w:ind w:firstLine="720"/>
+        <w:jc w:val="both"/>
       </w:pPr>
       <w:r>
         <w:t xml:space="preserve">La vulnerabilidad estructural se califica </w:t>
@@ -10986,6 +11083,7 @@
     <w:p>
       <w:pPr>
         <w:ind w:firstLine="720"/>
+        <w:jc w:val="both"/>
       </w:pPr>
       <w:r>
         <w:t xml:space="preserve">Para la reconstrucción se establecen como criterios técnicos mínimos: concreto de resistencia no inferior a 35 MPa con adiciones puzolánicas que controlen la permeabilidad; cemento resistente a sulfatos; relación agua/cemento máxima de 0,45; recubrimientos no inferiores a 50 mm; protección catódica activa y recubrimientos anticorrosivos para todos los elementos metálicos; y un programa de mantenimiento preventivo formulado desde el diseño, con periodicidad diferenciada según el elemento. Cualquier diseño de reemplazo debe estar precedido, no obstante, por una valoración hidráulica actualizada del sistema.</w:t>
@@ -10994,6 +11092,7 @@
     <w:p>
       <w:pPr>
         <w:ind w:firstLine="720"/>
+        <w:jc w:val="both"/>
       </w:pPr>
       <w:r>
         <w:t xml:space="preserve">Como línea de investigación futura se propone complementar el diagnóstico con perfiles de cloruros por profundidad y medición de potenciales de corrosión conforme a la ASTM C876, con el fin de calibrar modelos de predicción de vida útil para el litoral Caribe colombiano</w:t>
@@ -11026,6 +11125,7 @@
       <w:pPr>
         <w:spacing w:after="120"/>
         <w:ind w:left="720" w:hanging="720"/>
+        <w:jc w:val="both"/>
       </w:pPr>
       <w:r>
         <w:rPr>
@@ -11055,6 +11155,7 @@
       <w:pPr>
         <w:spacing w:after="120"/>
         <w:ind w:left="720" w:hanging="720"/>
+        <w:jc w:val="both"/>
       </w:pPr>
       <w:r>
         <w:t xml:space="preserve">AIS. (1998). </w:t>
@@ -11074,6 +11175,7 @@
       <w:pPr>
         <w:spacing w:after="120"/>
         <w:ind w:left="720" w:hanging="720"/>
+        <w:jc w:val="both"/>
       </w:pPr>
       <w:r>
         <w:t xml:space="preserve">AIS. (2010). </w:t>
@@ -11093,6 +11195,7 @@
       <w:pPr>
         <w:spacing w:after="120"/>
         <w:ind w:left="720" w:hanging="720"/>
+        <w:jc w:val="both"/>
       </w:pPr>
       <w:r>
         <w:t xml:space="preserve">AIS. (2014). </w:t>
@@ -11112,6 +11215,7 @@
       <w:pPr>
         <w:spacing w:after="120"/>
         <w:ind w:left="720" w:hanging="720"/>
+        <w:jc w:val="both"/>
       </w:pPr>
       <w:r>
         <w:t xml:space="preserve">Alcaldía Mayor de Cartagena de Indias. (2024). </w:t>
@@ -11131,6 +11235,7 @@
       <w:pPr>
         <w:spacing w:after="120"/>
         <w:ind w:left="720" w:hanging="720"/>
+        <w:jc w:val="both"/>
       </w:pPr>
       <w:r>
         <w:rPr>
@@ -11153,6 +11258,7 @@
       <w:pPr>
         <w:spacing w:after="120"/>
         <w:ind w:left="720" w:hanging="720"/>
+        <w:jc w:val="both"/>
       </w:pPr>
       <w:r>
         <w:lastRenderedPageBreak/>
@@ -11173,6 +11279,7 @@
       <w:pPr>
         <w:spacing w:after="120"/>
         <w:ind w:left="720" w:hanging="720"/>
+        <w:jc w:val="both"/>
         <w:rPr>
           <w:lang w:val="en-US"/>
         </w:rPr>
@@ -11202,6 +11309,7 @@
       <w:pPr>
         <w:spacing w:after="120"/>
         <w:ind w:left="720" w:hanging="720"/>
+        <w:jc w:val="both"/>
         <w:rPr>
           <w:lang w:val="en-US"/>
         </w:rPr>
@@ -11231,6 +11339,7 @@
       <w:pPr>
         <w:spacing w:after="120"/>
         <w:ind w:left="720" w:hanging="720"/>
+        <w:jc w:val="both"/>
         <w:rPr>
           <w:lang w:val="en-US"/>
         </w:rPr>
@@ -11263,6 +11372,7 @@
       <w:pPr>
         <w:spacing w:after="120"/>
         <w:ind w:left="720" w:hanging="720"/>
+        <w:jc w:val="both"/>
         <w:rPr>
           <w:lang w:val="en-US"/>
         </w:rPr>
@@ -11292,6 +11402,7 @@
       <w:pPr>
         <w:spacing w:after="120"/>
         <w:ind w:left="720" w:hanging="720"/>
+        <w:jc w:val="both"/>
         <w:rPr>
           <w:lang w:val="en-US"/>
         </w:rPr>
@@ -11321,6 +11432,7 @@
       <w:pPr>
         <w:spacing w:after="120"/>
         <w:ind w:left="720" w:hanging="720"/>
+        <w:jc w:val="both"/>
         <w:rPr>
           <w:lang w:val="en-US"/>
         </w:rPr>
@@ -11350,6 +11462,7 @@
       <w:pPr>
         <w:spacing w:after="120"/>
         <w:ind w:left="720" w:hanging="720"/>
+        <w:jc w:val="both"/>
         <w:rPr>
           <w:lang w:val="en-US"/>
         </w:rPr>
@@ -11379,6 +11492,7 @@
       <w:pPr>
         <w:spacing w:after="120"/>
         <w:ind w:left="720" w:hanging="720"/>
+        <w:jc w:val="both"/>
         <w:rPr>
           <w:lang w:val="en-US"/>
         </w:rPr>
@@ -11408,6 +11522,7 @@
       <w:pPr>
         <w:spacing w:after="120"/>
         <w:ind w:left="720" w:hanging="720"/>
+        <w:jc w:val="both"/>
       </w:pPr>
       <w:r>
         <w:rPr>
@@ -11437,6 +11552,7 @@
       <w:pPr>
         <w:spacing w:after="120"/>
         <w:ind w:left="720" w:hanging="720"/>
+        <w:jc w:val="both"/>
       </w:pPr>
       <w:r>
         <w:t xml:space="preserve">Caracol Radio. (2018, 18 de abril). </w:t>
@@ -11456,6 +11572,7 @@
       <w:pPr>
         <w:spacing w:after="120"/>
         <w:ind w:left="720" w:hanging="720"/>
+        <w:jc w:val="both"/>
       </w:pPr>
       <w:r>
         <w:t xml:space="preserve">Centro Tecnológico de Componentes. (2018). </w:t>
@@ -11475,6 +11592,7 @@
       <w:pPr>
         <w:spacing w:after="120"/>
         <w:ind w:left="720" w:hanging="720"/>
+        <w:jc w:val="both"/>
       </w:pPr>
       <w:r>
         <w:t xml:space="preserve">Chávez-Ulloa, E. (2013). Deterioro de estructuras de concreto por carbonatación en medio ambiente marino tropical y cámara de carbonatación acelerada. </w:t>
@@ -11494,6 +11612,7 @@
       <w:pPr>
         <w:spacing w:after="120"/>
         <w:ind w:left="720" w:hanging="720"/>
+        <w:jc w:val="both"/>
       </w:pPr>
       <w:r>
         <w:rPr>
@@ -11516,6 +11635,7 @@
       <w:pPr>
         <w:spacing w:after="120"/>
         <w:ind w:left="720" w:hanging="720"/>
+        <w:jc w:val="both"/>
       </w:pPr>
       <w:r>
         <w:t xml:space="preserve">Establecimiento Público Ambiental de Cartagena. (2023). </w:t>
@@ -11535,6 +11655,7 @@
       <w:pPr>
         <w:spacing w:after="120"/>
         <w:ind w:left="720" w:hanging="720"/>
+        <w:jc w:val="both"/>
         <w:rPr>
           <w:ins w:id="9486" w:author="Luis David Arroyo Anaya" w:date="2026-10-10T18:00:00Z"/>
         </w:rPr>
@@ -11571,6 +11692,7 @@
       <w:pPr>
         <w:spacing w:after="120"/>
         <w:ind w:left="720" w:hanging="720"/>
+        <w:jc w:val="both"/>
         <w:rPr>
           <w:lang w:val="en-US"/>
         </w:rPr>
@@ -11600,6 +11722,7 @@
       <w:pPr>
         <w:spacing w:after="120"/>
         <w:ind w:left="720" w:hanging="720"/>
+        <w:jc w:val="both"/>
       </w:pPr>
       <w:r>
         <w:t xml:space="preserve">Helene, P. (2003). </w:t>
@@ -11619,6 +11742,7 @@
       <w:pPr>
         <w:spacing w:after="120"/>
         <w:ind w:left="720" w:hanging="720"/>
+        <w:jc w:val="both"/>
         <w:rPr>
           <w:lang w:val="en-US"/>
         </w:rPr>
@@ -11647,6 +11771,7 @@
       <w:pPr>
         <w:spacing w:after="120"/>
         <w:ind w:left="720" w:hanging="720"/>
+        <w:jc w:val="both"/>
         <w:rPr>
           <w:ins w:id="9490" w:author="Luis David Arroyo Anaya" w:date="2026-10-10T18:00:00Z"/>
         </w:rPr>
@@ -11683,6 +11808,7 @@
       <w:pPr>
         <w:spacing w:after="120"/>
         <w:ind w:left="720" w:hanging="720"/>
+        <w:jc w:val="both"/>
         <w:rPr>
           <w:ins w:id="9494" w:author="Luis David Arroyo Anaya" w:date="2026-10-10T18:00:00Z"/>
         </w:rPr>
@@ -11719,6 +11845,7 @@
       <w:pPr>
         <w:spacing w:after="120"/>
         <w:ind w:left="720" w:hanging="720"/>
+        <w:jc w:val="both"/>
         <w:rPr>
           <w:lang w:val="en-US"/>
         </w:rPr>
@@ -11749,6 +11876,7 @@
       <w:pPr>
         <w:spacing w:after="120"/>
         <w:ind w:left="720" w:hanging="720"/>
+        <w:jc w:val="both"/>
         <w:rPr>
           <w:lang w:val="en-US"/>
         </w:rPr>
@@ -11804,6 +11932,7 @@
       <w:pPr>
         <w:spacing w:after="120"/>
         <w:ind w:left="720" w:hanging="720"/>
+        <w:jc w:val="both"/>
       </w:pPr>
       <w:r>
         <w:t xml:space="preserve">Olavarrieta, J., Andrade, C., &amp; Troconis de Rincón, O. (2011). Evaluación de estructuras de concreto armado en ambiente marino tropical. </w:t>
@@ -11823,6 +11952,7 @@
       <w:pPr>
         <w:spacing w:after="120"/>
         <w:ind w:left="720" w:hanging="720"/>
+        <w:jc w:val="both"/>
       </w:pPr>
       <w:r>
         <w:t xml:space="preserve">Oñate López, V. (2022). </w:t>
@@ -11842,6 +11972,7 @@
       <w:pPr>
         <w:spacing w:after="120"/>
         <w:ind w:left="720" w:hanging="720"/>
+        <w:jc w:val="both"/>
         <w:rPr>
           <w:lang w:val="en-US"/>
         </w:rPr>
@@ -11874,6 +12005,7 @@
       <w:pPr>
         <w:spacing w:after="120"/>
         <w:ind w:left="720" w:hanging="720"/>
+        <w:jc w:val="both"/>
       </w:pPr>
       <w:r>
         <w:rPr>
@@ -11896,6 +12028,7 @@
       <w:pPr>
         <w:spacing w:after="120"/>
         <w:ind w:left="720" w:hanging="720"/>
+        <w:jc w:val="both"/>
       </w:pPr>
       <w:r>
         <w:t xml:space="preserve">Papadakis, V. G., Vayenas, C. G., &amp; Fardis, M. N. (1991). </w:t>
@@ -11921,6 +12054,7 @@
       <w:pPr>
         <w:spacing w:after="120"/>
         <w:ind w:left="720" w:hanging="720"/>
+        <w:jc w:val="both"/>
       </w:pPr>
       <w:r>
         <w:t xml:space="preserve">Pedroso Martínez, M., Pedro da Fonseca, J., &amp; Morales Armas, O. (2024). Las construcciones costeras: su durabilidad ante el impacto ambiental. </w:t>
@@ -11940,6 +12074,7 @@
       <w:pPr>
         <w:spacing w:after="120"/>
         <w:ind w:left="720" w:hanging="720"/>
+        <w:jc w:val="both"/>
         <w:rPr>
           <w:lang w:val="en-US"/>
         </w:rPr>
@@ -11969,6 +12104,7 @@
       <w:pPr>
         <w:spacing w:after="120"/>
         <w:ind w:left="720" w:hanging="720"/>
+        <w:jc w:val="both"/>
       </w:pPr>
       <w:r>
         <w:rPr>
@@ -11994,6 +12130,7 @@
       <w:pPr>
         <w:spacing w:after="120"/>
         <w:ind w:left="720" w:hanging="720"/>
+        <w:jc w:val="both"/>
         <w:rPr>
           <w:lang w:val="en-US"/>
         </w:rPr>
@@ -12026,6 +12163,7 @@
       <w:pPr>
         <w:spacing w:after="120"/>
         <w:ind w:left="720" w:hanging="720"/>
+        <w:jc w:val="both"/>
         <w:rPr>
           <w:lang w:val="en-US"/>
         </w:rPr>
@@ -12055,6 +12193,7 @@
       <w:pPr>
         <w:spacing w:after="120"/>
         <w:ind w:left="720" w:hanging="720"/>
+        <w:jc w:val="both"/>
         <w:rPr>
           <w:lang w:val="en-US"/>
         </w:rPr>
@@ -12084,6 +12223,7 @@
       <w:pPr>
         <w:spacing w:after="120"/>
         <w:ind w:left="720" w:hanging="720"/>
+        <w:jc w:val="both"/>
       </w:pPr>
       <w:r>
         <w:rPr>
@@ -12113,6 +12253,7 @@
       <w:pPr>
         <w:spacing w:after="120"/>
         <w:ind w:left="720" w:hanging="720"/>
+        <w:jc w:val="both"/>
       </w:pPr>
       <w:r>
         <w:t xml:space="preserve">Troconis de Rincón, O. M., Sánchez, M., Millano, V., Fernández, R., Anzola de Partidas, E., Martínez, I., Rebolledo, N., Barboza, M., Montenegro, J. C., Vera, R., Carvajal, A. M., Mejía de Gutiérrez, R., Maldonado, J., Guerrero, C., Saborio-Leiva, E., Villalobos-González, C., Pérez-Quiroz, J. T., Torres-Acosta, A., Castro-Borges, P., … Derrégibus, M. (2011). Impacto del ambiente tropical en la durabilidad de las estructuras de concreto armado. </w:t>
@@ -12132,6 +12273,7 @@
       <w:pPr>
         <w:spacing w:after="120"/>
         <w:ind w:left="720" w:hanging="720"/>
+        <w:jc w:val="both"/>
         <w:rPr>
           <w:lang w:val="en-US"/>
         </w:rPr>
@@ -12161,6 +12303,7 @@
       <w:pPr>
         <w:spacing w:after="120"/>
         <w:ind w:left="720" w:hanging="720"/>
+        <w:jc w:val="both"/>
         <w:rPr>
           <w:lang w:val="en-US"/>
         </w:rPr>
@@ -12189,6 +12332,7 @@
       <w:pPr>
         <w:spacing w:after="120"/>
         <w:ind w:left="720" w:hanging="720"/>
+        <w:jc w:val="both"/>
       </w:pPr>
       <w:r>
         <w:rPr>
@@ -12305,6 +12449,7 @@
     <w:p>
       <w:pPr>
         <w:spacing w:before="80" w:after="220"/>
+        <w:jc w:val="both"/>
       </w:pPr>
       <w:r>
         <w:rPr>
@@ -12394,6 +12539,7 @@
     <w:p>
       <w:pPr>
         <w:spacing w:before="80" w:after="220"/>
+        <w:jc w:val="both"/>
       </w:pPr>
       <w:r>
         <w:rPr>
@@ -12496,6 +12642,7 @@
     <w:p>
       <w:pPr>
         <w:spacing w:before="80" w:after="220"/>
+        <w:jc w:val="both"/>
       </w:pPr>
       <w:r>
         <w:rPr>
@@ -12584,6 +12731,7 @@
     <w:p>
       <w:pPr>
         <w:spacing w:before="80" w:after="220"/>
+        <w:jc w:val="both"/>
       </w:pPr>
       <w:r>
         <w:rPr>
@@ -12673,6 +12821,7 @@
     <w:p>
       <w:pPr>
         <w:spacing w:before="80" w:after="220"/>
+        <w:jc w:val="both"/>
       </w:pPr>
       <w:r>
         <w:rPr>
@@ -12762,6 +12911,7 @@
     <w:p>
       <w:pPr>
         <w:spacing w:before="80" w:after="220"/>
+        <w:jc w:val="both"/>
       </w:pPr>
       <w:r>
         <w:rPr>
@@ -12790,6 +12940,7 @@
     <w:p>
       <w:pPr>
         <w:ind w:firstLine="720"/>
+        <w:jc w:val="both"/>
       </w:pPr>
       <w:r>
         <w:t>Este anexo sustenta la calificación de la calidad del diseño y la construcción como buena, empleada en la asignación del coeficiente φc de la Tabla A.10.4-1 de la NSR-10 (numeral 4.4). El registro documenta la existencia de control técnico durante la ejecución, el empleo de concreto premezclado y la conformidad del proceso constructivo con las prácticas de la época.</w:t>
@@ -13062,6 +13213,7 @@
     <w:p>
       <w:pPr>
         <w:spacing w:before="80" w:after="220"/>
+        <w:jc w:val="both"/>
       </w:pPr>
       <w:r>
         <w:rPr>
@@ -15958,6 +16110,7 @@
     <w:p>
       <w:pPr>
         <w:spacing w:before="80" w:after="220"/>
+        <w:jc w:val="both"/>
       </w:pPr>
       <w:r>
         <w:rPr>
@@ -16438,6 +16591,7 @@
     <w:p>
       <w:pPr>
         <w:spacing w:before="80" w:after="220"/>
+        <w:jc w:val="both"/>
       </w:pPr>
       <w:r>
         <w:rPr>

</xml_diff>